<commit_message>
initial phase 1 on the project with basic functionality
</commit_message>
<xml_diff>
--- a/TradeOff.docx
+++ b/TradeOff.docx
@@ -24,7 +24,6 @@
         </w:rPr>
         <w:tab/>
       </w:r>
-      <w:proofErr w:type="spellStart"/>
       <w:r>
         <w:rPr>
           <w:b/>
@@ -34,7 +33,6 @@
         </w:rPr>
         <w:t>TradeOff</w:t>
       </w:r>
-      <w:proofErr w:type="spellEnd"/>
       <w:r>
         <w:rPr>
           <w:b/>
@@ -80,23 +78,7 @@
           <w:sz w:val="28"/>
           <w:szCs w:val="28"/>
         </w:rPr>
-        <w:t xml:space="preserve">The goal of </w:t>
-      </w:r>
-      <w:proofErr w:type="spellStart"/>
-      <w:r>
-        <w:rPr>
-          <w:sz w:val="28"/>
-          <w:szCs w:val="28"/>
-        </w:rPr>
-        <w:t>TradeOff</w:t>
-      </w:r>
-      <w:proofErr w:type="spellEnd"/>
-      <w:r>
-        <w:rPr>
-          <w:sz w:val="28"/>
-          <w:szCs w:val="28"/>
-        </w:rPr>
-        <w:t xml:space="preserve"> is to help users make smarter financial decisions by translating the price of a purchase into the amount of time they must work to afford it, based on their salary/stipend and working hours. The app focuses on psychological clarity rather than complex financial advice.</w:t>
+        <w:t>The goal of TradeOff is to help users make smarter financial decisions by translating the price of a purchase into the amount of time they must work to afford it, based on their salary/stipend and working hours. The app focuses on psychological clarity rather than complex financial advice.</w:t>
       </w:r>
     </w:p>
     <w:p>
@@ -112,6 +94,7 @@
       </w:pPr>
       <w:r>
         <w:rPr>
+          <w:noProof/>
           <w:sz w:val="28"/>
           <w:szCs w:val="28"/>
         </w:rPr>
@@ -226,6 +209,7 @@
       </w:pPr>
       <w:r>
         <w:rPr>
+          <w:noProof/>
           <w:sz w:val="28"/>
           <w:szCs w:val="28"/>
         </w:rPr>
@@ -371,46 +355,14 @@
           <w:sz w:val="28"/>
           <w:szCs w:val="28"/>
         </w:rPr>
-        <w:t xml:space="preserve"> Purchase history panel Design &amp; UX direction: Dark theme (</w:t>
-      </w:r>
-      <w:proofErr w:type="gramStart"/>
-      <w:r>
-        <w:rPr>
-          <w:sz w:val="28"/>
-          <w:szCs w:val="28"/>
-        </w:rPr>
-        <w:t>near-black</w:t>
-      </w:r>
-      <w:proofErr w:type="gramEnd"/>
-      <w:r>
-        <w:rPr>
-          <w:sz w:val="28"/>
-          <w:szCs w:val="28"/>
-        </w:rPr>
-        <w:t xml:space="preserve">) with purple/blue accents Calm, modern, reflective UI Subtle animations (no </w:t>
-      </w:r>
-      <w:proofErr w:type="gramStart"/>
-      <w:r>
-        <w:rPr>
-          <w:sz w:val="28"/>
-          <w:szCs w:val="28"/>
-        </w:rPr>
-        <w:t>clutter)</w:t>
-      </w:r>
-      <w:r>
-        <w:rPr>
-          <w:sz w:val="28"/>
-          <w:szCs w:val="28"/>
-        </w:rPr>
-        <w:t>(</w:t>
-      </w:r>
-      <w:proofErr w:type="gramEnd"/>
-      <w:r>
-        <w:rPr>
-          <w:sz w:val="28"/>
-          <w:szCs w:val="28"/>
-        </w:rPr>
-        <w:t xml:space="preserve"> theme we can alternate as per our liking)</w:t>
+        <w:t xml:space="preserve"> Purchase history panel Design &amp; UX direction: Dark theme (near-black) with purple/blue accents Calm, modern, reflective UI Subtle animations (no clutter)</w:t>
+      </w:r>
+      <w:r>
+        <w:rPr>
+          <w:sz w:val="28"/>
+          <w:szCs w:val="28"/>
+        </w:rPr>
+        <w:t>( theme we can alternate as per our liking)</w:t>
       </w:r>
       <w:r>
         <w:rPr>
@@ -489,23 +441,7 @@
           <w:sz w:val="28"/>
           <w:szCs w:val="28"/>
         </w:rPr>
-        <w:t xml:space="preserve">find myself buying impulsively or most of the times overcomplicating a purchase’s worth, this eventually leads to unnecessary calculations and mindless surfing to make the “Optimal” purchase decision, so I came up with this product – Tradeoff, it assists my purchasing  decisions through telling me the actual worth of that thing </w:t>
-      </w:r>
-      <w:proofErr w:type="spellStart"/>
-      <w:r>
-        <w:rPr>
-          <w:sz w:val="28"/>
-          <w:szCs w:val="28"/>
-        </w:rPr>
-        <w:t>i.e</w:t>
-      </w:r>
-      <w:proofErr w:type="spellEnd"/>
-      <w:r>
-        <w:rPr>
-          <w:sz w:val="28"/>
-          <w:szCs w:val="28"/>
-        </w:rPr>
-        <w:t xml:space="preserve"> not money but my Time, it not only calculates the time to money value of a product but also will help in avoiding impulsive buying decisions whose worth is a bit high(time), it is not a financial or a analytical project but more like a reflection/</w:t>
+        <w:t>find myself buying impulsively or most of the times overcomplicating a purchase’s worth, this eventually leads to unnecessary calculations and mindless surfing to make the “Optimal” purchase decision, so I came up with this product – Tradeoff, it assists my purchasing  decisions through telling me the actual worth of that thing i.e not money but my Time, it not only calculates the time to money value of a product but also will help in avoiding impulsive buying decisions whose worth is a bit high(time), it is not a financial or a analytical project but more like a reflection/</w:t>
       </w:r>
       <w:r>
         <w:rPr>
@@ -1128,6 +1064,7 @@
   <w:style w:type="character" w:default="1" w:styleId="DefaultParagraphFont">
     <w:name w:val="Default Paragraph Font"/>
     <w:uiPriority w:val="1"/>
+    <w:semiHidden/>
     <w:unhideWhenUsed/>
   </w:style>
   <w:style w:type="table" w:default="1" w:styleId="TableNormal">

</xml_diff>

<commit_message>
feat: add loading states
</commit_message>
<xml_diff>
--- a/TradeOff.docx
+++ b/TradeOff.docx
@@ -417,9 +417,10 @@
           <w:tab w:val="center" w:pos="4680"/>
           <w:tab w:val="left" w:pos="5865"/>
         </w:tabs>
-        <w:rPr>
-          <w:sz w:val="28"/>
-          <w:szCs w:val="28"/>
+        <w:jc w:val="center"/>
+        <w:rPr>
+          <w:sz w:val="48"/>
+          <w:szCs w:val="48"/>
         </w:rPr>
       </w:pPr>
       <w:r>
@@ -449,6 +450,209 @@
           <w:szCs w:val="28"/>
         </w:rPr>
         <w:t>phycological clarity aimed project, it shows facts about your purchase decisions, track them, avoid impulse buying and at times helps you reflect too. This is not a product but a tool I believe every person must use while spending their money(time).</w:t>
+      </w:r>
+      <w:r>
+        <w:rPr>
+          <w:sz w:val="28"/>
+          <w:szCs w:val="28"/>
+        </w:rPr>
+        <w:br/>
+      </w:r>
+      <w:r>
+        <w:rPr>
+          <w:sz w:val="28"/>
+          <w:szCs w:val="28"/>
+        </w:rPr>
+        <w:br/>
+      </w:r>
+      <w:r>
+        <w:rPr>
+          <w:sz w:val="28"/>
+          <w:szCs w:val="28"/>
+        </w:rPr>
+        <w:br/>
+      </w:r>
+      <w:r>
+        <w:rPr>
+          <w:sz w:val="28"/>
+          <w:szCs w:val="28"/>
+        </w:rPr>
+        <w:br/>
+      </w:r>
+      <w:r>
+        <w:rPr>
+          <w:sz w:val="28"/>
+          <w:szCs w:val="28"/>
+        </w:rPr>
+        <w:br/>
+      </w:r>
+      <w:r>
+        <w:rPr>
+          <w:sz w:val="28"/>
+          <w:szCs w:val="28"/>
+        </w:rPr>
+        <w:br/>
+      </w:r>
+      <w:r>
+        <w:rPr>
+          <w:sz w:val="28"/>
+          <w:szCs w:val="28"/>
+        </w:rPr>
+        <w:br/>
+      </w:r>
+      <w:r>
+        <w:rPr>
+          <w:sz w:val="28"/>
+          <w:szCs w:val="28"/>
+        </w:rPr>
+        <w:br/>
+      </w:r>
+      <w:r>
+        <w:rPr>
+          <w:sz w:val="28"/>
+          <w:szCs w:val="28"/>
+        </w:rPr>
+        <w:br/>
+      </w:r>
+      <w:r>
+        <w:rPr>
+          <w:sz w:val="28"/>
+          <w:szCs w:val="28"/>
+        </w:rPr>
+        <w:br/>
+      </w:r>
+      <w:r>
+        <w:rPr>
+          <w:sz w:val="28"/>
+          <w:szCs w:val="28"/>
+        </w:rPr>
+        <w:br/>
+      </w:r>
+      <w:r>
+        <w:rPr>
+          <w:sz w:val="28"/>
+          <w:szCs w:val="28"/>
+        </w:rPr>
+        <w:br/>
+      </w:r>
+      <w:r>
+        <w:rPr>
+          <w:sz w:val="28"/>
+          <w:szCs w:val="28"/>
+        </w:rPr>
+        <w:br/>
+      </w:r>
+      <w:r>
+        <w:rPr>
+          <w:sz w:val="28"/>
+          <w:szCs w:val="28"/>
+        </w:rPr>
+        <w:br/>
+      </w:r>
+      <w:r>
+        <w:rPr>
+          <w:sz w:val="28"/>
+          <w:szCs w:val="28"/>
+        </w:rPr>
+        <w:br/>
+      </w:r>
+      <w:r>
+        <w:rPr>
+          <w:sz w:val="28"/>
+          <w:szCs w:val="28"/>
+        </w:rPr>
+        <w:br/>
+      </w:r>
+      <w:r>
+        <w:rPr>
+          <w:sz w:val="28"/>
+          <w:szCs w:val="28"/>
+        </w:rPr>
+        <w:br/>
+      </w:r>
+      <w:r>
+        <w:rPr>
+          <w:sz w:val="28"/>
+          <w:szCs w:val="28"/>
+        </w:rPr>
+        <w:br/>
+      </w:r>
+      <w:r>
+        <w:rPr>
+          <w:sz w:val="28"/>
+          <w:szCs w:val="28"/>
+        </w:rPr>
+        <w:br/>
+      </w:r>
+      <w:r>
+        <w:rPr>
+          <w:sz w:val="28"/>
+          <w:szCs w:val="28"/>
+        </w:rPr>
+        <w:br/>
+      </w:r>
+      <w:r>
+        <w:rPr>
+          <w:sz w:val="28"/>
+          <w:szCs w:val="28"/>
+        </w:rPr>
+        <w:lastRenderedPageBreak/>
+        <w:br/>
+      </w:r>
+      <w:r>
+        <w:rPr>
+          <w:sz w:val="48"/>
+          <w:szCs w:val="48"/>
+        </w:rPr>
+        <w:t>Todo</w:t>
+      </w:r>
+    </w:p>
+    <w:p>
+      <w:pPr>
+        <w:tabs>
+          <w:tab w:val="center" w:pos="4680"/>
+          <w:tab w:val="left" w:pos="5865"/>
+        </w:tabs>
+        <w:jc w:val="center"/>
+        <w:rPr>
+          <w:sz w:val="48"/>
+          <w:szCs w:val="48"/>
+        </w:rPr>
+      </w:pPr>
+    </w:p>
+    <w:p>
+      <w:pPr>
+        <w:tabs>
+          <w:tab w:val="center" w:pos="4680"/>
+          <w:tab w:val="left" w:pos="5865"/>
+        </w:tabs>
+        <w:rPr>
+          <w:sz w:val="28"/>
+          <w:szCs w:val="28"/>
+        </w:rPr>
+      </w:pPr>
+      <w:r>
+        <w:rPr>
+          <w:sz w:val="48"/>
+          <w:szCs w:val="48"/>
+        </w:rPr>
+        <w:t>1 – validation for the signup/login page</w:t>
+      </w:r>
+      <w:r>
+        <w:rPr>
+          <w:sz w:val="48"/>
+          <w:szCs w:val="48"/>
+        </w:rPr>
+        <w:br/>
+        <w:t>2 – loading screen for the signup/login page</w:t>
+      </w:r>
+      <w:r>
+        <w:rPr>
+          <w:sz w:val="48"/>
+          <w:szCs w:val="48"/>
+        </w:rPr>
+        <w:br/>
+        <w:t xml:space="preserve">3 – auto scroll when checking the price </w:t>
       </w:r>
     </w:p>
     <w:sectPr>

</xml_diff>